<commit_message>
Corrige modelos de velório e condolências
</commit_message>
<xml_diff>
--- a/public/templates/official/velorio/condolencias.docx
+++ b/public/templates/official/velorio/condolencias.docx
@@ -1,6 +1,6 @@
 
 <file path=word/document.xml><?xml version="1.0" encoding="utf-8"?>
-<w:document xmlns:wpc="http://schemas.microsoft.com/office/word/2010/wordprocessingCanvas" xmlns:cx="http://schemas.microsoft.com/office/drawing/2014/chartex" xmlns:cx1="http://schemas.microsoft.com/office/drawing/2015/9/8/chartex" xmlns:cx2="http://schemas.microsoft.com/office/drawing/2015/10/21/chartex" xmlns:cx3="http://schemas.microsoft.com/office/drawing/2016/5/9/chartex" xmlns:cx4="http://schemas.microsoft.com/office/drawing/2016/5/10/chartex" xmlns:cx5="http://schemas.microsoft.com/office/drawing/2016/5/11/chartex" xmlns:cx6="http://schemas.microsoft.com/office/drawing/2016/5/12/chartex" xmlns:cx7="http://schemas.microsoft.com/office/drawing/2016/5/13/chartex" xmlns:cx8="http://schemas.microsoft.com/office/drawing/2016/5/14/chartex" xmlns:mc="http://schemas.openxmlformats.org/markup-compatibility/2006" xmlns:aink="http://schemas.microsoft.com/office/drawing/2016/ink" xmlns:am3d="http://schemas.microsoft.com/office/drawing/2017/model3d" xmlns:o="urn:schemas-microsoft-com:office:office" xmlns:oel="http://schemas.microsoft.com/office/2019/extlst" xmlns:r="http://schemas.openxmlformats.org/officeDocument/2006/relationships" xmlns:m="http://schemas.openxmlformats.org/officeDocument/2006/math" xmlns:v="urn:schemas-microsoft-com:vml" xmlns:wp14="http://schemas.microsoft.com/office/word/2010/wordprocessingDrawing" xmlns:wp="http://schemas.openxmlformats.org/drawingml/2006/wordprocessingDrawing" xmlns:w10="urn:schemas-microsoft-com:office:word" xmlns:w="http://schemas.openxmlformats.org/wordprocessingml/2006/main" xmlns:w14="http://schemas.microsoft.com/office/word/2010/wordml" xmlns:w15="http://schemas.microsoft.com/office/word/2012/wordml" xmlns:w16cex="http://schemas.microsoft.com/office/word/2018/wordml/cex" xmlns:w16cid="http://schemas.microsoft.com/office/word/2016/wordml/cid" xmlns:w16="http://schemas.microsoft.com/office/word/2018/wordml" xmlns:w16du="http://schemas.microsoft.com/office/word/2023/wordml/word16du" xmlns:w16sdtdh="http://schemas.microsoft.com/office/word/2020/wordml/sdtdatahash" xmlns:w16sdtfl="http://schemas.microsoft.com/office/word/2024/wordml/sdtformatlock" xmlns:w16se="http://schemas.microsoft.com/office/word/2015/wordml/symex" xmlns:wpg="http://schemas.microsoft.com/office/word/2010/wordprocessingGroup" xmlns:wpi="http://schemas.microsoft.com/office/word/2010/wordprocessingInk" xmlns:wne="http://schemas.microsoft.com/office/word/2006/wordml" xmlns:wps="http://schemas.microsoft.com/office/word/2010/wordprocessingShape" mc:Ignorable="w14 w15 w16se w16cid w16 w16cex w16sdtdh w16sdtfl w16du wp14">
+<w:document xmlns:wpc="http://schemas.microsoft.com/office/word/2010/wordprocessingCanvas" xmlns:cx="http://schemas.microsoft.com/office/drawing/2014/chartex" xmlns:cx1="http://schemas.microsoft.com/office/drawing/2015/9/8/chartex" xmlns:cx2="http://schemas.microsoft.com/office/drawing/2015/10/21/chartex" xmlns:cx3="http://schemas.microsoft.com/office/drawing/2016/5/9/chartex" xmlns:cx4="http://schemas.microsoft.com/office/drawing/2016/5/10/chartex" xmlns:cx5="http://schemas.microsoft.com/office/drawing/2016/5/11/chartex" xmlns:cx6="http://schemas.microsoft.com/office/drawing/2016/5/12/chartex" xmlns:cx7="http://schemas.microsoft.com/office/drawing/2016/5/13/chartex" xmlns:cx8="http://schemas.microsoft.com/office/drawing/2016/5/14/chartex" xmlns:mc="http://schemas.openxmlformats.org/markup-compatibility/2006" xmlns:aink="http://schemas.microsoft.com/office/drawing/2016/ink" xmlns:am3d="http://schemas.microsoft.com/office/drawing/2017/model3d" xmlns:o="urn:schemas-microsoft-com:office:office" xmlns:oel="http://schemas.microsoft.com/office/2019/extlst" xmlns:r="http://schemas.openxmlformats.org/officeDocument/2006/relationships" xmlns:m="http://schemas.openxmlformats.org/officeDocument/2006/math" xmlns:v="urn:schemas-microsoft-com:vml" xmlns:wp14="http://schemas.microsoft.com/office/word/2010/wordprocessingDrawing" xmlns:wp="http://schemas.openxmlformats.org/drawingml/2006/wordprocessingDrawing" xmlns:w10="urn:schemas-microsoft-com:office:word" xmlns:w="http://schemas.openxmlformats.org/wordprocessingml/2006/main" xmlns:w14="http://schemas.microsoft.com/office/word/2010/wordml" xmlns:w15="http://schemas.microsoft.com/office/word/2012/wordml" xmlns:w16cex="http://schemas.microsoft.com/office/word/2018/wordml/cex" xmlns:w16cid="http://schemas.microsoft.com/office/word/2016/wordml/cid" xmlns:w16="http://schemas.microsoft.com/office/word/2018/wordml" xmlns:w16sdtdh="http://schemas.microsoft.com/office/word/2020/wordml/sdtdatahash" xmlns:w16se="http://schemas.microsoft.com/office/word/2015/wordml/symex" xmlns:wpg="http://schemas.microsoft.com/office/word/2010/wordprocessingGroup" xmlns:wpi="http://schemas.microsoft.com/office/word/2010/wordprocessingInk" xmlns:wne="http://schemas.microsoft.com/office/word/2006/wordml" xmlns:wps="http://schemas.microsoft.com/office/word/2010/wordprocessingShape" mc:Ignorable="w14 w15 w16se w16cid w16 w16cex w16sdtdh wp14">
   <w:background w:color="FFFFFF" w:themeColor="background1"/>
   <w:body>
     <w:p>
@@ -133,10 +133,10 @@
           <w:rFonts w:ascii="Bookman Old Style" w:hAnsi="Bookman Old Style" w:cs="Dreaming Outloud Script Pro"/>
           <w:b/>
           <w:bCs/>
-          <w:sz w:val="22"/>
-          <w:szCs w:val="22"/>
-        </w:rPr>
-        <w:t>Falecido(a) {{nomeFal}}</w:t>
+          <w:sz w:val="28"/>
+          <w:szCs w:val="28"/>
+        </w:rPr>
+        <w:t>Falecido</w:t>
       </w:r>
       <w:r>
         <w:rPr>
@@ -146,6 +146,7 @@
           <w:sz w:val="28"/>
           <w:szCs w:val="28"/>
         </w:rPr>
+        <w:t>(a)</w:t>
       </w:r>
       <w:r>
         <w:rPr>
@@ -155,6 +156,7 @@
           <w:sz w:val="28"/>
           <w:szCs w:val="28"/>
         </w:rPr>
+        <w:t xml:space="preserve"> </w:t>
       </w:r>
       <w:r>
         <w:rPr>
@@ -163,11 +165,12 @@
           <w:bCs/>
           <w:color w:val="000000"/>
           <w:kern w:val="0"/>
-          <w:sz w:val="40"/>
-          <w:szCs w:val="40"/>
+          <w:sz w:val="32"/>
+          <w:szCs w:val="32"/>
           <w:lang w:eastAsia="pt-BR"/>
           <w14:ligatures w14:val="none"/>
         </w:rPr>
+        <w:t>{{nomeFal}}</w:t>
       </w:r>
     </w:p>
     <w:p>
@@ -186,10 +189,10 @@
           <w:rFonts w:ascii="Bookman Old Style" w:hAnsi="Bookman Old Style" w:cs="Dreaming Outloud Script Pro"/>
           <w:b/>
           <w:bCs/>
-          <w:sz w:val="22"/>
-          <w:szCs w:val="22"/>
-        </w:rPr>
-        <w:t>Data: {{data}}                             Sala: {{sala}}</w:t>
+          <w:sz w:val="28"/>
+          <w:szCs w:val="28"/>
+        </w:rPr>
+        <w:t>Data</w:t>
       </w:r>
       <w:r>
         <w:rPr>
@@ -199,6 +202,7 @@
           <w:sz w:val="28"/>
           <w:szCs w:val="28"/>
         </w:rPr>
+        <w:t>:</w:t>
       </w:r>
       <w:r>
         <w:rPr>
@@ -208,6 +212,7 @@
           <w:sz w:val="28"/>
           <w:szCs w:val="28"/>
         </w:rPr>
+        <w:t xml:space="preserve"> </w:t>
       </w:r>
       <w:r>
         <w:rPr>
@@ -217,6 +222,7 @@
           <w:sz w:val="28"/>
           <w:szCs w:val="28"/>
         </w:rPr>
+        <w:t>{{data}}</w:t>
       </w:r>
       <w:r>
         <w:rPr>
@@ -226,6 +232,7 @@
           <w:sz w:val="28"/>
           <w:szCs w:val="28"/>
         </w:rPr>
+        <w:t/>
       </w:r>
       <w:r>
         <w:rPr>
@@ -235,6 +242,7 @@
           <w:sz w:val="28"/>
           <w:szCs w:val="28"/>
         </w:rPr>
+        <w:t/>
       </w:r>
       <w:r>
         <w:rPr>
@@ -244,6 +252,7 @@
           <w:sz w:val="28"/>
           <w:szCs w:val="28"/>
         </w:rPr>
+        <w:t/>
       </w:r>
       <w:r>
         <w:rPr>
@@ -253,6 +262,7 @@
           <w:sz w:val="28"/>
           <w:szCs w:val="28"/>
         </w:rPr>
+        <w:t/>
       </w:r>
       <w:r>
         <w:rPr>
@@ -262,6 +272,7 @@
           <w:sz w:val="28"/>
           <w:szCs w:val="28"/>
         </w:rPr>
+        <w:t/>
       </w:r>
       <w:r>
         <w:rPr>
@@ -271,51 +282,7 @@
           <w:sz w:val="28"/>
           <w:szCs w:val="28"/>
         </w:rPr>
-      </w:r>
-      <w:r>
-        <w:rPr>
-          <w:rFonts w:ascii="Bookman Old Style" w:hAnsi="Bookman Old Style" w:cs="Dreaming Outloud Script Pro"/>
-          <w:b/>
-          <w:bCs/>
-          <w:sz w:val="28"/>
-          <w:szCs w:val="28"/>
-        </w:rPr>
-      </w:r>
-      <w:r>
-        <w:rPr>
-          <w:rFonts w:ascii="Bookman Old Style" w:hAnsi="Bookman Old Style" w:cs="Dreaming Outloud Script Pro"/>
-          <w:b/>
-          <w:bCs/>
-          <w:sz w:val="28"/>
-          <w:szCs w:val="28"/>
-        </w:rPr>
-      </w:r>
-      <w:r>
-        <w:rPr>
-          <w:rFonts w:ascii="Bookman Old Style" w:hAnsi="Bookman Old Style" w:cs="Dreaming Outloud Script Pro"/>
-          <w:b/>
-          <w:bCs/>
-          <w:sz w:val="28"/>
-          <w:szCs w:val="28"/>
-        </w:rPr>
-      </w:r>
-      <w:r>
-        <w:rPr>
-          <w:rFonts w:ascii="Bookman Old Style" w:hAnsi="Bookman Old Style" w:cs="Dreaming Outloud Script Pro"/>
-          <w:b/>
-          <w:bCs/>
-          <w:sz w:val="28"/>
-          <w:szCs w:val="28"/>
-        </w:rPr>
-      </w:r>
-      <w:r>
-        <w:rPr>
-          <w:rFonts w:ascii="Bookman Old Style" w:hAnsi="Bookman Old Style" w:cs="Dreaming Outloud Script Pro"/>
-          <w:b/>
-          <w:bCs/>
-          <w:sz w:val="28"/>
-          <w:szCs w:val="28"/>
-        </w:rPr>
+        <w:t xml:space="preserve">                             </w:t>
       </w:r>
     </w:p>
     <w:p>
@@ -425,12 +392,6 @@
           <w:szCs w:val="28"/>
         </w:rPr>
         <w:sectPr>
-          <w:headerReference w:type="default" r:id="rId8"/>
-          <w:headerReference w:type="first" r:id="rId9"/>
-          <w:headerReference w:type="even" r:id="rId10"/>
-          <w:footerReference w:type="default" r:id="rId11"/>
-          <w:footerReference w:type="first" r:id="rId12"/>
-          <w:footerReference w:type="even" r:id="rId13"/>
           <w:pgSz w:w="11906" w:h="16838"/>
           <w:pgMar w:top="720" w:right="720" w:bottom="720" w:left="720" w:header="708" w:footer="708" w:gutter="0"/>
           <w:pgBorders w:offsetFrom="page">
@@ -1549,68 +1510,8 @@
 </w:document>
 </file>
 
-<file path=word/footer1.xml><?xml version="1.0" encoding="utf-8"?>
-<w:ftr xmlns:m="http://schemas.openxmlformats.org/officeDocument/2006/math" xmlns:mc="http://schemas.openxmlformats.org/markup-compatibility/2006" xmlns:mo="http://schemas.microsoft.com/office/mac/office/2008/main" xmlns:mv="urn:schemas-microsoft-com:mac:vml" xmlns:o="urn:schemas-microsoft-com:office:office" xmlns:r="http://schemas.openxmlformats.org/officeDocument/2006/relationships" xmlns:v="urn:schemas-microsoft-com:vml" xmlns:w10="urn:schemas-microsoft-com:office:word" xmlns:w14="http://schemas.microsoft.com/office/word/2010/wordml" xmlns:w="http://schemas.openxmlformats.org/wordprocessingml/2006/main" xmlns:wne="http://schemas.microsoft.com/office/word/2006/wordml" xmlns:wp14="http://schemas.microsoft.com/office/word/2010/wordprocessingDrawing" xmlns:wp="http://schemas.openxmlformats.org/drawingml/2006/wordprocessingDrawing" xmlns:wpc="http://schemas.microsoft.com/office/word/2010/wordprocessingCanvas" xmlns:wpg="http://schemas.microsoft.com/office/word/2010/wordprocessingGroup" xmlns:wpi="http://schemas.microsoft.com/office/word/2010/wordprocessingInk" xmlns:wps="http://schemas.microsoft.com/office/word/2010/wordprocessingShape" mc:Ignorable="w14 wp14">
-  <w:p>
-    <w:pPr>
-      <w:pStyle w:val="Footer"/>
-    </w:pPr>
-  </w:p>
-</w:ftr>
-</file>
-
-<file path=word/footer2.xml><?xml version="1.0" encoding="utf-8"?>
-<w:ftr xmlns:m="http://schemas.openxmlformats.org/officeDocument/2006/math" xmlns:mc="http://schemas.openxmlformats.org/markup-compatibility/2006" xmlns:mo="http://schemas.microsoft.com/office/mac/office/2008/main" xmlns:mv="urn:schemas-microsoft-com:mac:vml" xmlns:o="urn:schemas-microsoft-com:office:office" xmlns:r="http://schemas.openxmlformats.org/officeDocument/2006/relationships" xmlns:v="urn:schemas-microsoft-com:vml" xmlns:w10="urn:schemas-microsoft-com:office:word" xmlns:w14="http://schemas.microsoft.com/office/word/2010/wordml" xmlns:w="http://schemas.openxmlformats.org/wordprocessingml/2006/main" xmlns:wne="http://schemas.microsoft.com/office/word/2006/wordml" xmlns:wp14="http://schemas.microsoft.com/office/word/2010/wordprocessingDrawing" xmlns:wp="http://schemas.openxmlformats.org/drawingml/2006/wordprocessingDrawing" xmlns:wpc="http://schemas.microsoft.com/office/word/2010/wordprocessingCanvas" xmlns:wpg="http://schemas.microsoft.com/office/word/2010/wordprocessingGroup" xmlns:wpi="http://schemas.microsoft.com/office/word/2010/wordprocessingInk" xmlns:wps="http://schemas.microsoft.com/office/word/2010/wordprocessingShape" mc:Ignorable="w14 wp14">
-  <w:p>
-    <w:pPr>
-      <w:pStyle w:val="Footer"/>
-    </w:pPr>
-  </w:p>
-</w:ftr>
-</file>
-
-<file path=word/footer3.xml><?xml version="1.0" encoding="utf-8"?>
-<w:ftr xmlns:m="http://schemas.openxmlformats.org/officeDocument/2006/math" xmlns:mc="http://schemas.openxmlformats.org/markup-compatibility/2006" xmlns:mo="http://schemas.microsoft.com/office/mac/office/2008/main" xmlns:mv="urn:schemas-microsoft-com:mac:vml" xmlns:o="urn:schemas-microsoft-com:office:office" xmlns:r="http://schemas.openxmlformats.org/officeDocument/2006/relationships" xmlns:v="urn:schemas-microsoft-com:vml" xmlns:w10="urn:schemas-microsoft-com:office:word" xmlns:w14="http://schemas.microsoft.com/office/word/2010/wordml" xmlns:w="http://schemas.openxmlformats.org/wordprocessingml/2006/main" xmlns:wne="http://schemas.microsoft.com/office/word/2006/wordml" xmlns:wp14="http://schemas.microsoft.com/office/word/2010/wordprocessingDrawing" xmlns:wp="http://schemas.openxmlformats.org/drawingml/2006/wordprocessingDrawing" xmlns:wpc="http://schemas.microsoft.com/office/word/2010/wordprocessingCanvas" xmlns:wpg="http://schemas.microsoft.com/office/word/2010/wordprocessingGroup" xmlns:wpi="http://schemas.microsoft.com/office/word/2010/wordprocessingInk" xmlns:wps="http://schemas.microsoft.com/office/word/2010/wordprocessingShape" mc:Ignorable="w14 wp14">
-  <w:p>
-    <w:pPr>
-      <w:pStyle w:val="Footer"/>
-    </w:pPr>
-  </w:p>
-</w:ftr>
-</file>
-
-<file path=word/header1.xml><?xml version="1.0" encoding="utf-8"?>
-<w:hdr xmlns:m="http://schemas.openxmlformats.org/officeDocument/2006/math" xmlns:mc="http://schemas.openxmlformats.org/markup-compatibility/2006" xmlns:mo="http://schemas.microsoft.com/office/mac/office/2008/main" xmlns:mv="urn:schemas-microsoft-com:mac:vml" xmlns:o="urn:schemas-microsoft-com:office:office" xmlns:r="http://schemas.openxmlformats.org/officeDocument/2006/relationships" xmlns:v="urn:schemas-microsoft-com:vml" xmlns:w10="urn:schemas-microsoft-com:office:word" xmlns:w14="http://schemas.microsoft.com/office/word/2010/wordml" xmlns:w="http://schemas.openxmlformats.org/wordprocessingml/2006/main" xmlns:wne="http://schemas.microsoft.com/office/word/2006/wordml" xmlns:wp14="http://schemas.microsoft.com/office/word/2010/wordprocessingDrawing" xmlns:wp="http://schemas.openxmlformats.org/drawingml/2006/wordprocessingDrawing" xmlns:wpc="http://schemas.microsoft.com/office/word/2010/wordprocessingCanvas" xmlns:wpg="http://schemas.microsoft.com/office/word/2010/wordprocessingGroup" xmlns:wpi="http://schemas.microsoft.com/office/word/2010/wordprocessingInk" xmlns:wps="http://schemas.microsoft.com/office/word/2010/wordprocessingShape" mc:Ignorable="w14 wp14">
-  <w:p>
-    <w:pPr>
-      <w:pStyle w:val="Header"/>
-    </w:pPr>
-  </w:p>
-</w:hdr>
-</file>
-
-<file path=word/header2.xml><?xml version="1.0" encoding="utf-8"?>
-<w:hdr xmlns:m="http://schemas.openxmlformats.org/officeDocument/2006/math" xmlns:mc="http://schemas.openxmlformats.org/markup-compatibility/2006" xmlns:mo="http://schemas.microsoft.com/office/mac/office/2008/main" xmlns:mv="urn:schemas-microsoft-com:mac:vml" xmlns:o="urn:schemas-microsoft-com:office:office" xmlns:r="http://schemas.openxmlformats.org/officeDocument/2006/relationships" xmlns:v="urn:schemas-microsoft-com:vml" xmlns:w10="urn:schemas-microsoft-com:office:word" xmlns:w14="http://schemas.microsoft.com/office/word/2010/wordml" xmlns:w="http://schemas.openxmlformats.org/wordprocessingml/2006/main" xmlns:wne="http://schemas.microsoft.com/office/word/2006/wordml" xmlns:wp14="http://schemas.microsoft.com/office/word/2010/wordprocessingDrawing" xmlns:wp="http://schemas.openxmlformats.org/drawingml/2006/wordprocessingDrawing" xmlns:wpc="http://schemas.microsoft.com/office/word/2010/wordprocessingCanvas" xmlns:wpg="http://schemas.microsoft.com/office/word/2010/wordprocessingGroup" xmlns:wpi="http://schemas.microsoft.com/office/word/2010/wordprocessingInk" xmlns:wps="http://schemas.microsoft.com/office/word/2010/wordprocessingShape" mc:Ignorable="w14 wp14">
-  <w:p>
-    <w:pPr>
-      <w:pStyle w:val="Header"/>
-    </w:pPr>
-  </w:p>
-</w:hdr>
-</file>
-
-<file path=word/header3.xml><?xml version="1.0" encoding="utf-8"?>
-<w:hdr xmlns:m="http://schemas.openxmlformats.org/officeDocument/2006/math" xmlns:mc="http://schemas.openxmlformats.org/markup-compatibility/2006" xmlns:mo="http://schemas.microsoft.com/office/mac/office/2008/main" xmlns:mv="urn:schemas-microsoft-com:mac:vml" xmlns:o="urn:schemas-microsoft-com:office:office" xmlns:r="http://schemas.openxmlformats.org/officeDocument/2006/relationships" xmlns:v="urn:schemas-microsoft-com:vml" xmlns:w10="urn:schemas-microsoft-com:office:word" xmlns:w14="http://schemas.microsoft.com/office/word/2010/wordml" xmlns:w="http://schemas.openxmlformats.org/wordprocessingml/2006/main" xmlns:wne="http://schemas.microsoft.com/office/word/2006/wordml" xmlns:wp14="http://schemas.microsoft.com/office/word/2010/wordprocessingDrawing" xmlns:wp="http://schemas.openxmlformats.org/drawingml/2006/wordprocessingDrawing" xmlns:wpc="http://schemas.microsoft.com/office/word/2010/wordprocessingCanvas" xmlns:wpg="http://schemas.microsoft.com/office/word/2010/wordprocessingGroup" xmlns:wpi="http://schemas.microsoft.com/office/word/2010/wordprocessingInk" xmlns:wps="http://schemas.microsoft.com/office/word/2010/wordprocessingShape" mc:Ignorable="w14 wp14">
-  <w:p>
-    <w:pPr>
-      <w:pStyle w:val="Header"/>
-    </w:pPr>
-  </w:p>
-</w:hdr>
-</file>
-
 <file path=word/styles.xml><?xml version="1.0" encoding="utf-8"?>
-<w:styles xmlns:mc="http://schemas.openxmlformats.org/markup-compatibility/2006" xmlns:r="http://schemas.openxmlformats.org/officeDocument/2006/relationships" xmlns:w="http://schemas.openxmlformats.org/wordprocessingml/2006/main" xmlns:w14="http://schemas.microsoft.com/office/word/2010/wordml" xmlns:w15="http://schemas.microsoft.com/office/word/2012/wordml" xmlns:w16cex="http://schemas.microsoft.com/office/word/2018/wordml/cex" xmlns:w16cid="http://schemas.microsoft.com/office/word/2016/wordml/cid" xmlns:w16="http://schemas.microsoft.com/office/word/2018/wordml" xmlns:w16du="http://schemas.microsoft.com/office/word/2023/wordml/word16du" xmlns:w16sdtdh="http://schemas.microsoft.com/office/word/2020/wordml/sdtdatahash" xmlns:w16sdtfl="http://schemas.microsoft.com/office/word/2024/wordml/sdtformatlock" xmlns:w16se="http://schemas.microsoft.com/office/word/2015/wordml/symex" mc:Ignorable="w14 w15 w16se w16cid w16 w16cex w16sdtdh w16sdtfl w16du">
+<w:styles xmlns:mc="http://schemas.openxmlformats.org/markup-compatibility/2006" xmlns:r="http://schemas.openxmlformats.org/officeDocument/2006/relationships" xmlns:w="http://schemas.openxmlformats.org/wordprocessingml/2006/main" xmlns:w14="http://schemas.microsoft.com/office/word/2010/wordml" xmlns:w15="http://schemas.microsoft.com/office/word/2012/wordml" xmlns:w16cex="http://schemas.microsoft.com/office/word/2018/wordml/cex" xmlns:w16cid="http://schemas.microsoft.com/office/word/2016/wordml/cid" xmlns:w16="http://schemas.microsoft.com/office/word/2018/wordml" xmlns:w16sdtdh="http://schemas.microsoft.com/office/word/2020/wordml/sdtdatahash" xmlns:w16se="http://schemas.microsoft.com/office/word/2015/wordml/symex" mc:Ignorable="w14 w15 w16se w16cid w16 w16cex w16sdtdh">
   <w:docDefaults>
     <w:rPrDefault>
       <w:rPr>

</xml_diff>